<commit_message>
Add final CAB230 submission package
</commit_message>
<xml_diff>
--- a/03 Projects/cab230-submission/report.docx
+++ b/03 Projects/cab230-submission/report.docx
@@ -21,22 +21,9 @@
       </w:pPr>
       <w:r>
         <w:rPr>
-          <w:color w:val="505050"/>
-          <w:sz w:val="22"/>
-        </w:rPr>
-        <w:t>Colby Oosthuizen | n11595388 | Generated 30 April 2026</w:t>
-      </w:r>
-    </w:p>
-    <w:p>
-      <w:pPr>
-        <w:spacing w:after="120" w:line="259" w:lineRule="auto"/>
-      </w:pPr>
-      <w:r>
-        <w:rPr>
-          <w:rFonts w:ascii="Aptos" w:hAnsi="Aptos"/>
-          <w:sz w:val="21"/>
-        </w:rPr>
-        <w:t>This report follows the structure of the provided university report template. It explains what the application does, how the required API endpoints are used, how the React application is organised, what was tested, and what limitations remain.</w:t>
+          <w:rFonts w:ascii="Aptos" w:hAnsi="Aptos"/>
+        </w:rPr>
+        <w:t>Colby Oosthuizen | n11595388</w:t>
       </w:r>
     </w:p>
     <w:p>

</xml_diff>